<commit_message>
feat: add deposition testimony extractor, work activity monitor, report reviewer, and multiple enhancements
- Deposition testimony extractor: 3-stage pipeline (parse → LLM select → verbatim output), multi-transcript support with drag-and-drop, session persistence, resizable prompt input, 100% PDF highlight hit rate
- Work activity monitor: background service with 7 capture threads, daily/weekly AI summaries, Task Scheduler integration
- Report reviewer: LLM-powered review engine for litigation reports
- Word AI assistant: improved redline engine with flat diff architecture, paragraph-aware application
- Report generator: AI_OUTPUT.docx ingestion, EXPERTS keyword routing, template fixes
- iCharlotte: faulthandler crash diagnostics, DirectoryTreeWorker logging, case switch stability
- Word validator: shared validation library with redline and report check suites

Co-Authored-By: Claude Opus 4.6 <noreply@anthropic.com>
</commit_message>
<xml_diff>
--- a/Templates/litigation_report.docx
+++ b/Templates/litigation_report.docx
@@ -4525,6 +4525,22 @@
       </w:pPr>
       <w:r/>
     </w:p>
+    <w:p/>
+    <w:p>
+      <w:r>
+        <w:rPr>
+          <w:b/>
+          <w:u w:val="single"/>
+        </w:rPr>
+        <w:t>EXPERTS</w:t>
+      </w:r>
+    </w:p>
+    <w:p>
+      <w:r>
+        <w:t>{{ experts }}</w:t>
+      </w:r>
+    </w:p>
+    <w:p/>
     <w:p>
       <w:pPr>
         <w:rPr>

</xml_diff>